<commit_message>
feat: support per-author book profiles
</commit_message>
<xml_diff>
--- a/templates/reference_v7.docx
+++ b/templates/reference_v7.docx
@@ -1130,8 +1130,9 @@
     <w:name w:val="Verbatim Char"/>
     <w:basedOn w:val="BodyTextChar"/>
     <w:rPr>
-      <w:rFonts w:ascii="Consolas" w:hAnsi="Consolas"/>
-      <w:sz w:val="22"/>
+      <w:rFonts w:ascii="Consolas" w:hAnsi="Consolas" w:eastAsia="Consolas" w:cs="Consolas"/>
+      <w:sz w:val="20"/>
+      <w:color w:val="333333"/>
     </w:rPr>
   </w:style>
   <w:style w:type="character" w:customStyle="1" w:styleId="SectionNumber">
@@ -1169,6 +1170,14 @@
       <w:bCs w:val="0"/>
       <w:color w:val="1E5BFF" w:themeColor="accent1" w:themeShade="BF"/>
       <w:sz w:val="36"/>
+    </w:rPr>
+  </w:style>
+  <w:style w:type="paragraph" w:customStyle="1" w:styleId="SourceCode">
+    <w:name w:val="Source Code"/>
+    <w:rPr>
+      <w:rFonts w:ascii="Consolas" w:hAnsi="Consolas" w:eastAsia="Consolas" w:cs="Consolas"/>
+      <w:sz w:val="20"/>
+      <w:color w:val="333333"/>
     </w:rPr>
   </w:style>
 </w:styles>

</xml_diff>